<commit_message>
docs(research): live-path disclosure (8.3) and expert demo script
Section 8.3 states the measurement boundary plainly: every matrix and
blind-suite number in this package measures the single orchestrator loop;
the live chat route's intent fan-out/merge layer above it was never covered
by any evaluation until the 2026-08-06 demo-preflight walkthrough, which
found and closed two defects there (see the fix commit). The error budget
gains a matching row, and the validator asserts the disclosure stays.

The demo script covers: claim card (allowed vs withdrawn numbers), startup
commands, a 10-minute manual pixel checklist (the walkthrough exercised the
API layer; frontend rendering is covered by component tests plus this
checklist), a 22-minute per-prompt narrative with expected behaviors, live
fallback plans, and post-demo actions.

Co-Authored-By: Claude Fable 5 <noreply@anthropic.com>
</commit_message>
<xml_diff>
--- a/docs/research/formal_report_package_2026-08-06/02_Standard_Astro_v0.2_测试结果综述.docx
+++ b/docs/research/formal_report_package_2026-08-06/02_Standard_Astro_v0.2_测试结果综述.docx
@@ -11977,6 +11977,108 @@
                 <w:rFonts w:ascii="Arial Unicode MS" w:hAnsi="Arial Unicode MS" w:eastAsia="Arial Unicode MS"/>
                 <w:sz w:val="18"/>
               </w:rPr>
+              <w:t>实况分诊/合并层（此前在所有评测口径之外）</w:t>
+            </w:r>
+          </w:p>
+        </w:tc>
+        <w:tc>
+          <w:tcPr>
+            <w:tcW w:type="dxa" w:w="1300"/>
+            <w:vAlign w:val="center"/>
+            <w:tcMar>
+              <w:top w:w="80" w:type="dxa"/>
+              <w:start w:w="120" w:type="dxa"/>
+              <w:bottom w:w="80" w:type="dxa"/>
+              <w:end w:w="120" w:type="dxa"/>
+            </w:tcMar>
+          </w:tcPr>
+          <w:p>
+            <w:pPr>
+              <w:spacing w:after="0"/>
+              <w:jc w:val="left"/>
+            </w:pPr>
+            <w:r>
+              <w:rPr>
+                <w:rFonts w:ascii="Arial Unicode MS" w:hAnsi="Arial Unicode MS" w:eastAsia="Arial Unicode MS"/>
+                <w:sz w:val="18"/>
+              </w:rPr>
+              <w:t>系统性</w:t>
+            </w:r>
+          </w:p>
+        </w:tc>
+        <w:tc>
+          <w:tcPr>
+            <w:tcW w:type="dxa" w:w="1900"/>
+            <w:vAlign w:val="center"/>
+            <w:tcMar>
+              <w:top w:w="80" w:type="dxa"/>
+              <w:start w:w="120" w:type="dxa"/>
+              <w:bottom w:w="80" w:type="dxa"/>
+              <w:end w:w="120" w:type="dxa"/>
+            </w:tcMar>
+          </w:tcPr>
+          <w:p>
+            <w:pPr>
+              <w:spacing w:after="0"/>
+              <w:jc w:val="left"/>
+            </w:pPr>
+            <w:r>
+              <w:rPr>
+                <w:rFonts w:ascii="Arial Unicode MS" w:hAnsi="Arial Unicode MS" w:eastAsia="Arial Unicode MS"/>
+                <w:sz w:val="18"/>
+              </w:rPr>
+              <w:t>走查发现 2 缺陷，收口修复后 5/5 演示题实测通过</w:t>
+            </w:r>
+          </w:p>
+        </w:tc>
+        <w:tc>
+          <w:tcPr>
+            <w:tcW w:type="dxa" w:w="3260"/>
+            <w:vAlign w:val="center"/>
+            <w:tcMar>
+              <w:top w:w="80" w:type="dxa"/>
+              <w:start w:w="120" w:type="dxa"/>
+              <w:bottom w:w="80" w:type="dxa"/>
+              <w:end w:w="120" w:type="dxa"/>
+            </w:tcMar>
+          </w:tcPr>
+          <w:p>
+            <w:pPr>
+              <w:spacing w:after="0"/>
+              <w:jc w:val="left"/>
+            </w:pPr>
+            <w:r>
+              <w:rPr>
+                <w:rFonts w:ascii="Arial Unicode MS" w:hAnsi="Arial Unicode MS" w:eastAsia="Arial Unicode MS"/>
+                <w:sz w:val="18"/>
+              </w:rPr>
+              <w:t>见 8.3 节；该层仍无系统性矩阵覆盖，列为后续测量项</w:t>
+            </w:r>
+          </w:p>
+        </w:tc>
+      </w:tr>
+      <w:tr>
+        <w:tc>
+          <w:tcPr>
+            <w:tcW w:type="dxa" w:w="2900"/>
+            <w:vAlign w:val="center"/>
+            <w:tcMar>
+              <w:top w:w="80" w:type="dxa"/>
+              <w:start w:w="120" w:type="dxa"/>
+              <w:bottom w:w="80" w:type="dxa"/>
+              <w:end w:w="120" w:type="dxa"/>
+            </w:tcMar>
+          </w:tcPr>
+          <w:p>
+            <w:pPr>
+              <w:spacing w:after="0"/>
+              <w:jc w:val="left"/>
+            </w:pPr>
+            <w:r>
+              <w:rPr>
+                <w:rFonts w:ascii="Arial Unicode MS" w:hAnsi="Arial Unicode MS" w:eastAsia="Arial Unicode MS"/>
+                <w:sz w:val="18"/>
+              </w:rPr>
               <w:t>同义改写稳健性</w:t>
             </w:r>
           </w:p>
@@ -13115,6 +13217,30 @@
           <w:rFonts w:ascii="Arial Unicode MS" w:hAnsi="Arial Unicode MS" w:eastAsia="Arial Unicode MS"/>
         </w:rPr>
         <w:t>should-pass 误杀语料复验：修复前 15 条全部翻正，修复后余 1 条新类别残留（工具已成功运行并产出正确结果后，模型行文引用了用户自己提供的输入值，claim 门按“数字非本轮工具产出”规则扣留整条回复）。该残留已存入修复后语料文件；因修复它会触及内联数据反伪造防线（B1 类），按“先记录、不为 1/60 冒险动防线”处置。复跑过程中出现 17 个 CLI 瞬时传输失败，均按 repair 流程补齐（审计文件保留）。</w:t>
+      </w:r>
+    </w:p>
+    <w:p>
+      <w:pPr>
+        <w:pStyle w:val="Heading2"/>
+      </w:pPr>
+      <w:r>
+        <w:t>8.3 实况链路披露：意图分诊层此前不在任何评测口径内（2026-08-06 走查）</w:t>
+      </w:r>
+    </w:p>
+    <w:p>
+      <w:r>
+        <w:rPr>
+          <w:rFonts w:ascii="Arial Unicode MS" w:hAnsi="Arial Unicode MS" w:eastAsia="Arial Unicode MS"/>
+        </w:rPr>
+        <w:t>必须如实说明测量边界：本报告全部矩阵与盲测数字测的都是单 orchestrator 主循环（评测与盲测 harness 的直接调用口径）。真实网页聊天路由在该循环之上还有一层意图分诊与多专员合并（literature/observation 等专员各自作答后合并再过门），该层在本次演示预检走查前从未被任何评测覆盖。走查用演示题目在真实 HTTP 聊天端点实测发现两个由该层引入的缺陷：确定性小题被分诊给多个专员后重复运行文献工具（实验 1 实测 170.7s），且合并回复门可能扣留主循环已产出的正确凭证（实验 2 整条被扣）。</w:t>
+      </w:r>
+    </w:p>
+    <w:p>
+      <w:r>
+        <w:rPr>
+          <w:rFonts w:ascii="Arial Unicode MS" w:hAnsi="Arial Unicode MS" w:eastAsia="Arial Unicode MS"/>
+        </w:rPr>
+        <w:t>收口修复沿分诊层既有的“塌缩快道”先例：识别为 deterministic_source_check 的问题塌缩到单 orchestrator 循环（统一 RoutingDecision 的属地），不触碰门禁与分类器本体，带先红后绿回归测试。修复后同一 5 道演示题在真实端点复测：实验 1 由 170.7s 降至 0.1s、实验 2 恢复正确凭证（0.0s）、实验 8 确定性拒绝并携 untrusted 凭证（0.0s）、实验 7 能力缺口清单正确（21.0s）、实验 6 为唯一模型实时作答项（73.7s，内容正确）。遗留披露：像素层（前端渲染的凭证卡与徽章）由组件测试覆盖，本次走查未逐屏人工点验，演示前自查清单见演示脚本。</w:t>
       </w:r>
     </w:p>
     <w:p>

</xml_diff>